<commit_message>
docs: illustrate booking workflows and record scheduler verification
</commit_message>
<xml_diff>
--- a/Документация/03_Пользователю/Инструкция_пользователя.docx
+++ b/Документация/03_Пользователю/Инструкция_пользователя.docx
@@ -281,6 +281,40 @@
       </w:r>
       <w:r>
         <w:t>11</w:t>
+      </w:r>
+    </w:p>
+    <w:p>
+      <w:pPr>
+        <w:tabs>
+          <w:tab w:pos="9439" w:val="right" w:leader="dot"/>
+        </w:tabs>
+        <w:spacing w:after="180"/>
+      </w:pPr>
+      <w:hyperlink w:anchor="booking_screens_0">
+        <w:r>
+          <w:t>Приложение А Бронирование в интерфейсе</w:t>
+        </w:r>
+      </w:hyperlink>
+      <w:r>
+        <w:tab/>
+        <w:t>12</w:t>
+      </w:r>
+    </w:p>
+    <w:p>
+      <w:pPr>
+        <w:tabs>
+          <w:tab w:pos="9439" w:val="right" w:leader="dot"/>
+        </w:tabs>
+        <w:spacing w:after="180"/>
+      </w:pPr>
+      <w:hyperlink w:anchor="booking_screens_1">
+        <w:r>
+          <w:t>Приложение А1 Продажа и отмена брони</w:t>
+        </w:r>
+      </w:hyperlink>
+      <w:r>
+        <w:tab/>
+        <w:t>13</w:t>
       </w:r>
     </w:p>
     <w:p>
@@ -5186,6 +5220,266 @@
         <w:t>Резервное копирование и загрузку выгрузок выполняет администратор. DT заменяет содержимое выбранной базы и не используется для повседневного оформления операций. Если требуется восстановление, сначала сохраните текущую базу и согласуйте действия с ответственным.</w:t>
       </w:r>
     </w:p>
+    <w:p>
+      <w:pPr>
+        <w:pStyle w:val="Heading1"/>
+        <w:pageBreakBefore/>
+      </w:pPr>
+      <w:bookmarkStart w:id="8200" w:name="booking_screens_0"/>
+      <w:r>
+        <w:t>Приложение А Бронирование в интерфейсе</w:t>
+      </w:r>
+      <w:bookmarkEnd w:id="8200"/>
+    </w:p>
+    <w:p>
+      <w:r>
+        <w:t>Карточка на рисунке А.1 показывает проведённую бронь 20 л молока по 90 руб. Состояние документа — «Забронирована», сумма — 1 800 руб. Доступны команды «Продать по брони» и «Отменить бронь».</w:t>
+      </w:r>
+    </w:p>
+    <w:p>
+      <w:pPr>
+        <w:keepNext/>
+        <w:spacing w:after="60"/>
+      </w:pPr>
+      <w:r>
+        <w:drawing>
+          <wp:inline xmlns:a="http://schemas.openxmlformats.org/drawingml/2006/main" xmlns:pic="http://schemas.openxmlformats.org/drawingml/2006/picture">
+            <wp:extent cx="5940000" cy="2057785"/>
+            <wp:docPr id="3" name="Picture 3" descr="Рисунок А.1 Проведённая бронь и команды работы с ней"/>
+            <wp:cNvGraphicFramePr>
+              <a:graphicFrameLocks noChangeAspect="1"/>
+            </wp:cNvGraphicFramePr>
+            <a:graphic>
+              <a:graphicData uri="http://schemas.openxmlformats.org/drawingml/2006/picture">
+                <pic:pic>
+                  <pic:nvPicPr>
+                    <pic:cNvPr id="0" name="booking-posted-clean.png"/>
+                    <pic:cNvPicPr/>
+                  </pic:nvPicPr>
+                  <pic:blipFill>
+                    <a:blip r:embed="rId13"/>
+                    <a:srcRect l="0" r="0" t="18171" b="24971"/>
+                    <a:stretch>
+                      <a:fillRect/>
+                    </a:stretch>
+                  </pic:blipFill>
+                  <pic:spPr>
+                    <a:xfrm>
+                      <a:off x="0" y="0"/>
+                      <a:ext cx="5940000" cy="2057785"/>
+                    </a:xfrm>
+                    <a:prstGeom prst="rect"/>
+                  </pic:spPr>
+                </pic:pic>
+              </a:graphicData>
+            </a:graphic>
+          </wp:inline>
+        </w:drawing>
+      </w:r>
+    </w:p>
+    <w:p>
+      <w:pPr>
+        <w:spacing w:after="160"/>
+      </w:pPr>
+      <w:r>
+        <w:rPr>
+          <w:sz w:val="20"/>
+        </w:rPr>
+        <w:t>Рисунок А.1 Проведённая бронь и команды работы с ней</w:t>
+      </w:r>
+    </w:p>
+    <w:p>
+      <w:r>
+        <w:t>После проведения товар остаётся на складе, но резерв уменьшает количество, доступное для обычной продажи: 75 − 20 = 55 л.</w:t>
+      </w:r>
+    </w:p>
+    <w:p>
+      <w:pPr>
+        <w:keepNext/>
+        <w:spacing w:after="60"/>
+      </w:pPr>
+      <w:r>
+        <w:drawing>
+          <wp:inline xmlns:a="http://schemas.openxmlformats.org/drawingml/2006/main" xmlns:pic="http://schemas.openxmlformats.org/drawingml/2006/picture">
+            <wp:extent cx="5940000" cy="1580386"/>
+            <wp:docPr id="4" name="Picture 4" descr="Рисунок А.2 Молоко после бронирования: склад 75 л, резерв 20 л, свободно 55 л"/>
+            <wp:cNvGraphicFramePr>
+              <a:graphicFrameLocks noChangeAspect="1"/>
+            </wp:cNvGraphicFramePr>
+            <a:graphic>
+              <a:graphicData uri="http://schemas.openxmlformats.org/drawingml/2006/picture">
+                <pic:pic>
+                  <pic:nvPicPr>
+                    <pic:cNvPr id="0" name="MS02-booked.png"/>
+                    <pic:cNvPicPr/>
+                  </pic:nvPicPr>
+                  <pic:blipFill>
+                    <a:blip r:embed="rId14"/>
+                    <a:srcRect l="0" r="0" t="0" b="0"/>
+                    <a:stretch>
+                      <a:fillRect/>
+                    </a:stretch>
+                  </pic:blipFill>
+                  <pic:spPr>
+                    <a:xfrm>
+                      <a:off x="0" y="0"/>
+                      <a:ext cx="5940000" cy="1580386"/>
+                    </a:xfrm>
+                    <a:prstGeom prst="rect"/>
+                  </pic:spPr>
+                </pic:pic>
+              </a:graphicData>
+            </a:graphic>
+          </wp:inline>
+        </w:drawing>
+      </w:r>
+    </w:p>
+    <w:p>
+      <w:pPr>
+        <w:spacing w:after="160"/>
+      </w:pPr>
+      <w:r>
+        <w:rPr>
+          <w:sz w:val="20"/>
+        </w:rPr>
+        <w:t>Рисунок А.2 Молоко после бронирования: склад 75 л, резерв 20 л, свободно 55 л</w:t>
+      </w:r>
+    </w:p>
+    <w:p>
+      <w:r>
+        <w:t>Рисунок А.1 — снимок версии 1.2.0 от 24 октября 2026 года; он иллюстрирует состав брони и команды. Рисунки А.2–А.4 — снимки ручной перепроверки Ефимова С.Р. от 29 октября. Их исходные PNG сохранены в протоколах тестирования.</w:t>
+      </w:r>
+    </w:p>
+    <w:p>
+      <w:pPr>
+        <w:pStyle w:val="Heading1"/>
+        <w:pageBreakBefore/>
+      </w:pPr>
+      <w:bookmarkStart w:id="8201" w:name="booking_screens_1"/>
+      <w:r>
+        <w:t>Приложение А1 Продажа и отмена брони</w:t>
+      </w:r>
+      <w:bookmarkEnd w:id="8201"/>
+    </w:p>
+    <w:p>
+      <w:r>
+        <w:t>Продажа и отмена показаны как альтернативные действия с бронью 20 л. При продаже по брони уменьшается складской остаток и освобождается резерв.</w:t>
+      </w:r>
+    </w:p>
+    <w:p>
+      <w:pPr>
+        <w:keepNext/>
+        <w:spacing w:after="60"/>
+      </w:pPr>
+      <w:r>
+        <w:drawing>
+          <wp:inline xmlns:a="http://schemas.openxmlformats.org/drawingml/2006/main" xmlns:pic="http://schemas.openxmlformats.org/drawingml/2006/picture">
+            <wp:extent cx="5940000" cy="1878937"/>
+            <wp:docPr id="5" name="Picture 5" descr="Рисунок А.3 После продажи по брони: склад 55 л, резерв 0 л, свободно 55 л"/>
+            <wp:cNvGraphicFramePr>
+              <a:graphicFrameLocks noChangeAspect="1"/>
+            </wp:cNvGraphicFramePr>
+            <a:graphic>
+              <a:graphicData uri="http://schemas.openxmlformats.org/drawingml/2006/picture">
+                <pic:pic>
+                  <pic:nvPicPr>
+                    <pic:cNvPr id="0" name="MS03-linked-sale.png"/>
+                    <pic:cNvPicPr/>
+                  </pic:nvPicPr>
+                  <pic:blipFill>
+                    <a:blip r:embed="rId15"/>
+                    <a:srcRect l="0" r="0" t="0" b="0"/>
+                    <a:stretch>
+                      <a:fillRect/>
+                    </a:stretch>
+                  </pic:blipFill>
+                  <pic:spPr>
+                    <a:xfrm>
+                      <a:off x="0" y="0"/>
+                      <a:ext cx="5940000" cy="1878937"/>
+                    </a:xfrm>
+                    <a:prstGeom prst="rect"/>
+                  </pic:spPr>
+                </pic:pic>
+              </a:graphicData>
+            </a:graphic>
+          </wp:inline>
+        </w:drawing>
+      </w:r>
+    </w:p>
+    <w:p>
+      <w:pPr>
+        <w:spacing w:after="160"/>
+      </w:pPr>
+      <w:r>
+        <w:rPr>
+          <w:sz w:val="20"/>
+        </w:rPr>
+        <w:t>Рисунок А.3 После продажи по брони: склад 55 л, резерв 0 л, свободно 55 л</w:t>
+      </w:r>
+    </w:p>
+    <w:p>
+      <w:r>
+        <w:t>Если товар не выдан, команда «Отменить бронь» освобождает резерв. Количество на складе сохраняется: все 75 л снова доступны для продажи.</w:t>
+      </w:r>
+    </w:p>
+    <w:p>
+      <w:pPr>
+        <w:keepNext/>
+        <w:spacing w:after="60"/>
+      </w:pPr>
+      <w:r>
+        <w:drawing>
+          <wp:inline xmlns:a="http://schemas.openxmlformats.org/drawingml/2006/main" xmlns:pic="http://schemas.openxmlformats.org/drawingml/2006/picture">
+            <wp:extent cx="5940000" cy="1866562"/>
+            <wp:docPr id="6" name="Picture 6" descr="Рисунок А.4 После отмены брони: склад 75 л, резерв 0 л, свободно 75 л"/>
+            <wp:cNvGraphicFramePr>
+              <a:graphicFrameLocks noChangeAspect="1"/>
+            </wp:cNvGraphicFramePr>
+            <a:graphic>
+              <a:graphicData uri="http://schemas.openxmlformats.org/drawingml/2006/picture">
+                <pic:pic>
+                  <pic:nvPicPr>
+                    <pic:cNvPr id="0" name="MS02-cancelled.png"/>
+                    <pic:cNvPicPr/>
+                  </pic:nvPicPr>
+                  <pic:blipFill>
+                    <a:blip r:embed="rId16"/>
+                    <a:srcRect l="0" r="0" t="0" b="0"/>
+                    <a:stretch>
+                      <a:fillRect/>
+                    </a:stretch>
+                  </pic:blipFill>
+                  <pic:spPr>
+                    <a:xfrm>
+                      <a:off x="0" y="0"/>
+                      <a:ext cx="5940000" cy="1866562"/>
+                    </a:xfrm>
+                    <a:prstGeom prst="rect"/>
+                  </pic:spPr>
+                </pic:pic>
+              </a:graphicData>
+            </a:graphic>
+          </wp:inline>
+        </w:drawing>
+      </w:r>
+    </w:p>
+    <w:p>
+      <w:pPr>
+        <w:spacing w:after="160"/>
+      </w:pPr>
+      <w:r>
+        <w:rPr>
+          <w:sz w:val="20"/>
+        </w:rPr>
+        <w:t>Рисунок А.4 После отмены брони: склад 75 л, резерв 0 л, свободно 75 л</w:t>
+      </w:r>
+    </w:p>
+    <w:p>
+      <w:r>
+        <w:t>Эти кадры подтверждают резервирование, продажу и ручную отмену. Автоматическое снятие просроченной брони проверено отдельно 29 октября в протоколе «Расписание_брони_20261029»: в существующем задании базы требуется настроить повторение каждые 60 секунд. Без этой настройки ожидание одной минуты не гарантирует снятия резерва.</w:t>
+      </w:r>
+    </w:p>
     <w:sectPr>
       <w:headerReference w:type="default" r:id="rId9"/>
       <w:footerReference w:type="default" r:id="rId10"/>

</xml_diff>